<commit_message>
Complete Smart RAG V2 improvements, validation and documentation
</commit_message>
<xml_diff>
--- a/Documentation/Smart_RAG_Performance_Evaluation_Final.docx
+++ b/Documentation/Smart_RAG_Performance_Evaluation_Final.docx
@@ -1111,6 +1111,34 @@
         <w:t>Scoring decisions use the expected-answer rubric from the evaluation template and observed text in the CSV. They are an interpretive manual assessment, not an independently verified citation audit. Unanswerable refusals count as correct only for Q19 and Q20.</w:t>
       </w:r>
     </w:p>
+    <w:p>
+      <w:pPr>
+        <w:pStyle w:val="Heading1"/>
+      </w:pPr>
+      <w:r>
+        <w:t>V2 Implementation and Verification Update</w:t>
+      </w:r>
+    </w:p>
+    <w:p>
+      <w:r>
+        <w:t>Update date: 21 October 2026. The current V2 application uses qwen2.5:7b for structured answer generation and qwen2.5:3b for citation entailment and question relevance validation.</w:t>
+      </w:r>
+    </w:p>
+    <w:p>
+      <w:r>
+        <w:t>The latest complete automated test run passed 333 of 333 tests. A live Flask API test returned HTTP 200 and status 'answered' for a negated deep-learning question, with two accepted source-grounded facts citing page 6.</w:t>
+      </w:r>
+    </w:p>
+    <w:p>
+      <w:r>
+        <w:t>The previously reported 20-question accuracy result of 10/20 (50.0%) and its latency figures belong to the evaluation conducted on 12 October 2026. They have not been remeasured after the V2 improvements and should not be interpreted as current V2 accuracy.</w:t>
+      </w:r>
+    </w:p>
+    <w:p>
+      <w:r>
+        <w:t>The V2 improvements include structured generation, citation and relevance checks, question-fact consistency validation, and a limited retry mechanism for unanswered English negated yes/no questions. Generated claims continue through the validation pipeline.</w:t>
+      </w:r>
+    </w:p>
     <w:sectPr>
       <w:footerReference w:type="default" r:id="rId9"/>
       <w:pgSz w:w="12240" w:h="15840"/>

</xml_diff>